<commit_message>
🐛 fix(knowledgeGraph): DiffAndQualityPanel 错误态/空态二分（坑 #71 收尾）
diff/metrics 两个 catch 改为记录 loadError：失败渲染 Alert（含重试文案），真空才渲染 Empty；与 OntologyTreePanel/ProposalQueue 同口径。tsc 通过。
同 commit 收编：套版稿去除遗留空白 H2（生成器 ~/kw-docx/generate-taoban.py 同步）。
</commit_message>
<xml_diff>
--- a/competition/deliverables/【赛题3-模板1】开发设计文档-套版稿-2026-09-23.docx
+++ b/competition/deliverables/【赛题3-模板1】开发设计文档-套版稿-2026-09-23.docx
@@ -10225,18 +10225,6 @@
         </w:rPr>
         <w:t>（代码随开源仓库提交：github.com/qianfenaichou/nexent（fork）；本节不粘贴完整代码清单。关键模块与调用关系见第一章 §5.9 调用关系图与 docs/call-graph.md；从 clone 到复现见 docs/reproduce-README.md。）</w:t>
       </w:r>
-    </w:p>
-    <w:p>
-      <w:pPr>
-        <w:pStyle w:val="3"/>
-        <w:numPr>
-          <w:ilvl w:val="0"/>
-          <w:numId w:val="0"/>
-        </w:numPr>
-        <w:rPr>
-          <w:rFonts w:ascii="微软雅黑" w:hAnsi="微软雅黑" w:eastAsia="微软雅黑"/>
-        </w:rPr>
-      </w:pPr>
     </w:p>
     <w:p>
       <w:pPr>

</xml_diff>